<commit_message>
Conclusão: acrescentar o contributo para o entregável da Amorim
Novo parágrafo na secção 6, a registar que o dashboard sustenta um dos
entregáveis do Âmbito 2: a recomendação da Califórnia como geografia de
entrada. Liga os três visuais que suportam esse argumento (o funil da página
1, a camada dedicada ao estado e a página de geografia com os tiers) e a
página de sensibilidade, que dá a margem comercial ao ligar o alvo capturável
ao mix de produto.

Co-Authored-By: Claude Opus 5 <noreply@anthropic.com>
Claude-Session: https://claude.ai/code/session_016VKhyPuqURxdXREvm9yswd
</commit_message>
<xml_diff>
--- a/Relatorio_BusinessAnalytics_Dashboard_v2.docx
+++ b/Relatorio_BusinessAnalytics_Dashboard_v2.docx
@@ -1186,6 +1186,20 @@
       </w:pPr>
       <w:r>
         <w:t>O exercício mostrou que a qualidade de um dashboard depende sobretudo da disciplina do desenho. Um modelo de dados sólido, com fontes rastreáveis, uma pergunta clara por página e o visual adequado a cada tipo de comparação valem mais do que a acumulação de gráficos. O resultado serve ao mesmo tempo a avaliação académica e um projeto de consultoria real.</w:t>
+      </w:r>
+      <w:r/>
+      <w:r/>
+      <w:r/>
+      <w:r/>
+      <w:r/>
+    </w:p>
+    <w:p>
+      <w:pPr>
+        <w:spacing w:after="120" w:line="276" w:lineRule="auto"/>
+        <w:jc w:val="both"/>
+      </w:pPr>
+      <w:r>
+        <w:t>Do lado do projeto de consultoria, o dashboard acabou por sustentar um dos entregáveis do Âmbito 2: a recomendação da Califórnia como geografia de entrada nos Estados Unidos. O funil da primeira página mostra numa só imagem o percurso desde os 380 mil milhões de dólares do mercado total até ao sub-SAM californiano de 251 milhões, decomposto por segmento na camada dedicada ao estado. A página de geografia coloca a Califórnia no contexto dos restantes estados, com a classificação por tier a tornar visível o critério que levou à escolha em vez de a apresentar como conclusão fechada, e a página de sensibilidade liga o alvo capturável ao mix de produto especificado. O ganho para a equipa não foi apenas analítico: passou a existir um instrumento que permite defender a recomendação perante a Amorim mostrando o raciocínio, e não só o número final.</w:t>
       </w:r>
       <w:r/>
       <w:r/>

</xml_diff>